<commit_message>
CS575 Research Project Update
</commit_message>
<xml_diff>
--- a/BU/CS575/Project/Rissman_Research_Paper.docx
+++ b/BU/CS575/Project/Rissman_Research_Paper.docx
@@ -930,20 +930,35 @@
         <w:outlineLvl w:val="0"/>
         <w:rPr>
           <w:rFonts w:ascii="Times New Roman" w:eastAsia="Times New Roman" w:hAnsi="Times New Roman" w:cs="Times New Roman"/>
-          <w:color w:val="1B1C1D"/>
-          <w:kern w:val="36"/>
-          <w14:ligatures w14:val="none"/>
-        </w:rPr>
-      </w:pPr>
-      <w:r>
-        <w:rPr>
-          <w:rFonts w:ascii="Times New Roman" w:eastAsia="Times New Roman" w:hAnsi="Times New Roman" w:cs="Times New Roman"/>
           <w:b/>
           <w:bCs/>
           <w:color w:val="1B1C1D"/>
           <w:kern w:val="36"/>
           <w14:ligatures w14:val="none"/>
         </w:rPr>
+      </w:pPr>
+    </w:p>
+    <w:p>
+      <w:pPr>
+        <w:spacing w:after="0" w:line="480" w:lineRule="auto"/>
+        <w:outlineLvl w:val="0"/>
+        <w:rPr>
+          <w:rFonts w:ascii="Times New Roman" w:eastAsia="Times New Roman" w:hAnsi="Times New Roman" w:cs="Times New Roman"/>
+          <w:color w:val="1B1C1D"/>
+          <w:kern w:val="36"/>
+          <w14:ligatures w14:val="none"/>
+        </w:rPr>
+      </w:pPr>
+      <w:r>
+        <w:rPr>
+          <w:rFonts w:ascii="Times New Roman" w:eastAsia="Times New Roman" w:hAnsi="Times New Roman" w:cs="Times New Roman"/>
+          <w:b/>
+          <w:bCs/>
+          <w:color w:val="1B1C1D"/>
+          <w:kern w:val="36"/>
+          <w14:ligatures w14:val="none"/>
+        </w:rPr>
+        <w:lastRenderedPageBreak/>
         <w:t>Discussion</w:t>
       </w:r>
     </w:p>
@@ -963,7 +978,6 @@
           <w:kern w:val="36"/>
           <w14:ligatures w14:val="none"/>
         </w:rPr>
-        <w:lastRenderedPageBreak/>
         <w:t>Three recent protocols introduce novel ways to address priority inversion and related security vulnerabilities.</w:t>
       </w:r>
       <w:r>
@@ -1026,7 +1040,7 @@
           <w:kern w:val="36"/>
           <w14:ligatures w14:val="none"/>
         </w:rPr>
-        <w:t xml:space="preserve">REORDER++ targets schedule-based side-channel attacks by enhancing schedule randomization in dynamic-priority real-time systems. It builds upon the concept of using random priority inversions to break deterministic task execution patterns, thereby obfuscating timing information that attackers might exploit. The key innovation in REORDER++ is its use of an online priority inversion test, contrasting with previous methods like REORDER that relied on offline, worst-case budget calculations. This offline analysis often proved pessimistic, especially under heavy system loads, limiting the opportunities for randomization. REORDER++ utilizes runtime system information to more accurately assess the feasibility and available budget for </w:t>
+        <w:t xml:space="preserve">REORDER++ targets schedule-based side-channel attacks by enhancing schedule randomization in dynamic-priority real-time systems. It builds upon the concept of using random priority inversions to break deterministic task execution patterns, thereby obfuscating timing information that attackers might exploit. The key innovation in REORDER++ is its use of an online priority inversion test, contrasting with previous methods like REORDER that relied on offline, worst-case budget calculations. This offline analysis often proved pessimistic, especially under heavy system loads, limiting the opportunities for randomization. REORDER++ utilizes </w:t>
       </w:r>
       <w:r>
         <w:rPr>
@@ -1036,7 +1050,7 @@
           <w14:ligatures w14:val="none"/>
         </w:rPr>
         <w:lastRenderedPageBreak/>
-        <w:t xml:space="preserve">priority inversions at each scheduling point. This allows for significantly more randomization opportunities, particularly in high-utilization scenarios, enhancing the system's resilience against timing inference attacks without compromising schedulability, which is verified by the online test.   </w:t>
+        <w:t xml:space="preserve">runtime system information to more accurately assess the feasibility and available budget for priority inversions at each scheduling point. This allows for significantly more randomization opportunities, particularly in high-utilization scenarios, enhancing the system's resilience against timing inference attacks without compromising schedulability, which is verified by the online test.   </w:t>
       </w:r>
     </w:p>
     <w:p>
@@ -1073,7 +1087,6 @@
     <w:p>
       <w:pPr>
         <w:spacing w:after="0" w:line="480" w:lineRule="auto"/>
-        <w:ind w:firstLine="360"/>
         <w:outlineLvl w:val="0"/>
         <w:rPr>
           <w:rFonts w:ascii="Times New Roman" w:eastAsia="Times New Roman" w:hAnsi="Times New Roman" w:cs="Times New Roman"/>
@@ -1085,142 +1098,59 @@
       <w:r>
         <w:rPr>
           <w:rFonts w:ascii="Times New Roman" w:eastAsia="Times New Roman" w:hAnsi="Times New Roman" w:cs="Times New Roman"/>
-          <w:color w:val="1B1C1D"/>
-          <w:kern w:val="36"/>
-          <w14:ligatures w14:val="none"/>
-        </w:rPr>
-        <w:t xml:space="preserve">Addressing security from a different perspective, the Flush Task Incorporated Priority-Inheritance Protocol (FT-PIP) focuses on </w:t>
-      </w:r>
-      <w:r>
-        <w:rPr>
-          <w:rFonts w:ascii="Times New Roman" w:eastAsia="Times New Roman" w:hAnsi="Times New Roman" w:cs="Times New Roman"/>
-          <w:color w:val="1B1C1D"/>
-          <w:kern w:val="36"/>
-          <w14:ligatures w14:val="none"/>
-        </w:rPr>
-        <w:t xml:space="preserve">preventing information leakage via shared resources in multiprocessor real-time systems. It combines the traditional Priority Inheritance Protocol (PIP) with a Flush Task (FT) mechanism. PIP is employed to manage priority inversion arising from </w:t>
-      </w:r>
-      <w:r>
-        <w:rPr>
-          <w:rFonts w:ascii="Times New Roman" w:eastAsia="Times New Roman" w:hAnsi="Times New Roman" w:cs="Times New Roman"/>
-          <w:color w:val="1B1C1D"/>
-          <w:kern w:val="36"/>
-          <w14:ligatures w14:val="none"/>
+          <w:noProof/>
+          <w:color w:val="1B1C1D"/>
+          <w:kern w:val="36"/>
         </w:rPr>
         <w:lastRenderedPageBreak/>
-        <w:t>contention over shared resources, ensuring mutual exclusion for critical sections while mitigating blocking delays</w:t>
-      </w:r>
-      <w:r>
-        <w:rPr>
-          <w:rFonts w:ascii="Times New Roman" w:eastAsia="Times New Roman" w:hAnsi="Times New Roman" w:cs="Times New Roman"/>
-          <w:color w:val="1B1C1D"/>
-          <w:kern w:val="36"/>
-          <w14:ligatures w14:val="none"/>
-        </w:rPr>
-        <w:t xml:space="preserve"> (Fig. 2)</w:t>
-      </w:r>
-      <w:r>
-        <w:rPr>
-          <w:rFonts w:ascii="Times New Roman" w:eastAsia="Times New Roman" w:hAnsi="Times New Roman" w:cs="Times New Roman"/>
-          <w:color w:val="1B1C1D"/>
-          <w:kern w:val="36"/>
-          <w14:ligatures w14:val="none"/>
-        </w:rPr>
-        <w:t xml:space="preserve">. The novel aspect is </w:t>
-      </w:r>
-      <w:r>
-        <w:rPr>
-          <w:rFonts w:ascii="Times New Roman" w:eastAsia="Times New Roman" w:hAnsi="Times New Roman" w:cs="Times New Roman"/>
-          <w:color w:val="1B1C1D"/>
-          <w:kern w:val="36"/>
-          <w14:ligatures w14:val="none"/>
-        </w:rPr>
-        <w:t>its</w:t>
-      </w:r>
-      <w:r>
-        <w:rPr>
-          <w:rFonts w:ascii="Times New Roman" w:eastAsia="Times New Roman" w:hAnsi="Times New Roman" w:cs="Times New Roman"/>
-          <w:color w:val="1B1C1D"/>
-          <w:kern w:val="36"/>
-          <w14:ligatures w14:val="none"/>
-        </w:rPr>
-        <w:t xml:space="preserve"> integration of flush tasks, which are invoked conditionally based on a defined '</w:t>
-      </w:r>
-      <w:proofErr w:type="spellStart"/>
-      <w:r>
-        <w:rPr>
-          <w:rFonts w:ascii="Times New Roman" w:eastAsia="Times New Roman" w:hAnsi="Times New Roman" w:cs="Times New Roman"/>
-          <w:color w:val="1B1C1D"/>
-          <w:kern w:val="36"/>
-          <w14:ligatures w14:val="none"/>
-        </w:rPr>
-        <w:t>noleak</w:t>
-      </w:r>
-      <w:proofErr w:type="spellEnd"/>
-      <w:r>
-        <w:rPr>
-          <w:rFonts w:ascii="Times New Roman" w:eastAsia="Times New Roman" w:hAnsi="Times New Roman" w:cs="Times New Roman"/>
-          <w:color w:val="1B1C1D"/>
-          <w:kern w:val="36"/>
-          <w14:ligatures w14:val="none"/>
-        </w:rPr>
-        <w:t xml:space="preserve">' model specifying which transitions between tasks accessing a shared resource pose an information leakage risk. When a task finishes using a resource and another task begins, if a </w:t>
-      </w:r>
-      <w:proofErr w:type="spellStart"/>
-      <w:r>
-        <w:rPr>
-          <w:rFonts w:ascii="Times New Roman" w:eastAsia="Times New Roman" w:hAnsi="Times New Roman" w:cs="Times New Roman"/>
-          <w:color w:val="1B1C1D"/>
-          <w:kern w:val="36"/>
-          <w14:ligatures w14:val="none"/>
-        </w:rPr>
-        <w:t>noleak</w:t>
-      </w:r>
-      <w:proofErr w:type="spellEnd"/>
-      <w:r>
-        <w:rPr>
-          <w:rFonts w:ascii="Times New Roman" w:eastAsia="Times New Roman" w:hAnsi="Times New Roman" w:cs="Times New Roman"/>
-          <w:color w:val="1B1C1D"/>
-          <w:kern w:val="36"/>
-          <w14:ligatures w14:val="none"/>
-        </w:rPr>
-        <w:t xml:space="preserve"> relation exists between them for that resource, </w:t>
-      </w:r>
-      <w:r>
-        <w:rPr>
-          <w:rFonts w:ascii="Times New Roman" w:eastAsia="Times New Roman" w:hAnsi="Times New Roman" w:cs="Times New Roman"/>
-          <w:color w:val="1B1C1D"/>
-          <w:kern w:val="36"/>
-          <w14:ligatures w14:val="none"/>
-        </w:rPr>
-        <w:t>a flush task is executed to sanitize the resource state (e.g., clearing cache entries) preventing data remnants from being exploited in side-channel attacks</w:t>
-      </w:r>
-      <w:r>
-        <w:rPr>
-          <w:rFonts w:ascii="Times New Roman" w:eastAsia="Times New Roman" w:hAnsi="Times New Roman" w:cs="Times New Roman"/>
-          <w:color w:val="1B1C1D"/>
-          <w:kern w:val="36"/>
-          <w14:ligatures w14:val="none"/>
-        </w:rPr>
-        <w:t xml:space="preserve">. </w:t>
-      </w:r>
-      <w:r>
-        <w:rPr>
-          <w:rFonts w:ascii="Times New Roman" w:eastAsia="Times New Roman" w:hAnsi="Times New Roman" w:cs="Times New Roman"/>
-          <w:color w:val="1B1C1D"/>
-          <w:kern w:val="36"/>
-          <w14:ligatures w14:val="none"/>
-        </w:rPr>
-        <w:t>FT-PIP's contribution lies in providing a framework and associated schedulability analysis that guarantees timing constraints while satisfying security requirements for multiple shared resources on multiprocessor platforms, a scenario largely unaddressed by previous methods</w:t>
-      </w:r>
-      <w:r>
-        <w:rPr>
-          <w:rFonts w:ascii="Times New Roman" w:eastAsia="Times New Roman" w:hAnsi="Times New Roman" w:cs="Times New Roman"/>
-          <w:color w:val="1B1C1D"/>
-          <w:kern w:val="36"/>
-          <w14:ligatures w14:val="none"/>
-        </w:rPr>
-        <w:t xml:space="preserve">.   </w:t>
+        <w:drawing>
+          <wp:inline distT="0" distB="0" distL="0" distR="0" wp14:anchorId="4C7DB635" wp14:editId="30B966CD">
+            <wp:extent cx="5942806" cy="2521759"/>
+            <wp:effectExtent l="0" t="0" r="1270" b="5715"/>
+            <wp:docPr id="2051227428" name="Picture 2" descr="A diagram of a task&#10;&#10;AI-generated content may be incorrect."/>
+            <wp:cNvGraphicFramePr>
+              <a:graphicFrameLocks xmlns:a="http://schemas.openxmlformats.org/drawingml/2006/main" noChangeAspect="1"/>
+            </wp:cNvGraphicFramePr>
+            <a:graphic xmlns:a="http://schemas.openxmlformats.org/drawingml/2006/main">
+              <a:graphicData uri="http://schemas.openxmlformats.org/drawingml/2006/picture">
+                <pic:pic xmlns:pic="http://schemas.openxmlformats.org/drawingml/2006/picture">
+                  <pic:nvPicPr>
+                    <pic:cNvPr id="2051227428" name="Picture 2" descr="A diagram of a task&#10;&#10;AI-generated content may be incorrect."/>
+                    <pic:cNvPicPr/>
+                  </pic:nvPicPr>
+                  <pic:blipFill rotWithShape="1">
+                    <a:blip r:embed="rId7" cstate="print">
+                      <a:extLst>
+                        <a:ext uri="{28A0092B-C50C-407E-A947-70E740481C1C}">
+                          <a14:useLocalDpi xmlns:a14="http://schemas.microsoft.com/office/drawing/2010/main" val="0"/>
+                        </a:ext>
+                      </a:extLst>
+                    </a:blip>
+                    <a:srcRect t="9018" b="15545"/>
+                    <a:stretch/>
+                  </pic:blipFill>
+                  <pic:spPr bwMode="auto">
+                    <a:xfrm>
+                      <a:off x="0" y="0"/>
+                      <a:ext cx="5943600" cy="2522096"/>
+                    </a:xfrm>
+                    <a:prstGeom prst="rect">
+                      <a:avLst/>
+                    </a:prstGeom>
+                    <a:ln>
+                      <a:noFill/>
+                    </a:ln>
+                    <a:extLst>
+                      <a:ext uri="{53640926-AAD7-44D8-BBD7-CCE9431645EC}">
+                        <a14:shadowObscured xmlns:a14="http://schemas.microsoft.com/office/drawing/2010/main"/>
+                      </a:ext>
+                    </a:extLst>
+                  </pic:spPr>
+                </pic:pic>
+              </a:graphicData>
+            </a:graphic>
+          </wp:inline>
+        </w:drawing>
       </w:r>
     </w:p>
     <w:p>
@@ -1237,13 +1167,29 @@
       <w:r>
         <w:rPr>
           <w:rFonts w:ascii="Times New Roman" w:eastAsia="Times New Roman" w:hAnsi="Times New Roman" w:cs="Times New Roman"/>
-          <w:b/>
-          <w:bCs/>
-          <w:color w:val="1B1C1D"/>
-          <w:kern w:val="36"/>
-          <w14:ligatures w14:val="none"/>
-        </w:rPr>
-        <w:t>Conclusion</w:t>
+          <w:color w:val="1B1C1D"/>
+          <w:kern w:val="36"/>
+          <w14:ligatures w14:val="none"/>
+        </w:rPr>
+        <w:t xml:space="preserve">Figure 2. Priority Inheritance Protocol. Task L inherits the priority of Task H to prevent unbounded priority inversion </w:t>
+      </w:r>
+      <w:r>
+        <w:rPr>
+          <w:rFonts w:ascii="Times New Roman" w:eastAsia="Times New Roman" w:hAnsi="Times New Roman" w:cs="Times New Roman"/>
+          <w:color w:val="1B1C1D"/>
+          <w:kern w:val="36"/>
+          <w14:ligatures w14:val="none"/>
+        </w:rPr>
+        <w:t>by Task M</w:t>
+      </w:r>
+      <w:r>
+        <w:rPr>
+          <w:rFonts w:ascii="Times New Roman" w:eastAsia="Times New Roman" w:hAnsi="Times New Roman" w:cs="Times New Roman"/>
+          <w:color w:val="1B1C1D"/>
+          <w:kern w:val="36"/>
+          <w14:ligatures w14:val="none"/>
+        </w:rPr>
+        <w:t>.</w:t>
       </w:r>
     </w:p>
     <w:p>
@@ -1265,16 +1211,152 @@
           <w:kern w:val="36"/>
           <w14:ligatures w14:val="none"/>
         </w:rPr>
-        <w:t>E</w:t>
-      </w:r>
-      <w:r>
-        <w:rPr>
-          <w:rFonts w:ascii="Times New Roman" w:eastAsia="Times New Roman" w:hAnsi="Times New Roman" w:cs="Times New Roman"/>
-          <w:color w:val="1B1C1D"/>
-          <w:kern w:val="36"/>
-          <w14:ligatures w14:val="none"/>
-        </w:rPr>
-        <w:t>nhancing the security of real-time systems against timing-based attacks necessitates innovative scheduling strategies. Protocols like TimeDice and REORDER++ leverage controlled randomization to disrupt adversarial exploitation of system predictability. TimeDice introduces schedulability-preserving randomization at the partition level, specifically targeting the mitigation of covert timing channels by adding uncertainty to partition execution sequences. Similarly, REORDER++ employs enhanced online randomization within dynamic-priority systems, dynamically assessing inversion budgets to maximize unpredictability and counter schedule-based side-channel attacks without compromising guaranteed deadlines. Both represent significant advancements in using randomization as a defense mechanism against timing inference.</w:t>
+        <w:t xml:space="preserve">Addressing security from a different perspective, the Flush Task Incorporated Priority-Inheritance Protocol (FT-PIP) focuses on </w:t>
+      </w:r>
+      <w:r>
+        <w:rPr>
+          <w:rFonts w:ascii="Times New Roman" w:eastAsia="Times New Roman" w:hAnsi="Times New Roman" w:cs="Times New Roman"/>
+          <w:color w:val="1B1C1D"/>
+          <w:kern w:val="36"/>
+          <w14:ligatures w14:val="none"/>
+        </w:rPr>
+        <w:t>preventing information leakage via shared resources in multiprocessor real-time systems. It combines the traditional Priority Inheritance Protocol (PIP) with a Flush Task (FT) mechanism. PIP is employed to manage priority inversion arising from contention over shared resources, ensuring mutual exclusion for critical sections while mitigating blocking delays</w:t>
+      </w:r>
+      <w:r>
+        <w:rPr>
+          <w:rFonts w:ascii="Times New Roman" w:eastAsia="Times New Roman" w:hAnsi="Times New Roman" w:cs="Times New Roman"/>
+          <w:color w:val="1B1C1D"/>
+          <w:kern w:val="36"/>
+          <w14:ligatures w14:val="none"/>
+        </w:rPr>
+        <w:t xml:space="preserve"> (Fig. 2)</w:t>
+      </w:r>
+      <w:r>
+        <w:rPr>
+          <w:rFonts w:ascii="Times New Roman" w:eastAsia="Times New Roman" w:hAnsi="Times New Roman" w:cs="Times New Roman"/>
+          <w:color w:val="1B1C1D"/>
+          <w:kern w:val="36"/>
+          <w14:ligatures w14:val="none"/>
+        </w:rPr>
+        <w:t xml:space="preserve">. The novel aspect is </w:t>
+      </w:r>
+      <w:r>
+        <w:rPr>
+          <w:rFonts w:ascii="Times New Roman" w:eastAsia="Times New Roman" w:hAnsi="Times New Roman" w:cs="Times New Roman"/>
+          <w:color w:val="1B1C1D"/>
+          <w:kern w:val="36"/>
+          <w14:ligatures w14:val="none"/>
+        </w:rPr>
+        <w:t>its</w:t>
+      </w:r>
+      <w:r>
+        <w:rPr>
+          <w:rFonts w:ascii="Times New Roman" w:eastAsia="Times New Roman" w:hAnsi="Times New Roman" w:cs="Times New Roman"/>
+          <w:color w:val="1B1C1D"/>
+          <w:kern w:val="36"/>
+          <w14:ligatures w14:val="none"/>
+        </w:rPr>
+        <w:t xml:space="preserve"> integration of flush tasks, which are invoked conditionally based on a defined '</w:t>
+      </w:r>
+      <w:proofErr w:type="spellStart"/>
+      <w:r>
+        <w:rPr>
+          <w:rFonts w:ascii="Times New Roman" w:eastAsia="Times New Roman" w:hAnsi="Times New Roman" w:cs="Times New Roman"/>
+          <w:color w:val="1B1C1D"/>
+          <w:kern w:val="36"/>
+          <w14:ligatures w14:val="none"/>
+        </w:rPr>
+        <w:t>noleak</w:t>
+      </w:r>
+      <w:proofErr w:type="spellEnd"/>
+      <w:r>
+        <w:rPr>
+          <w:rFonts w:ascii="Times New Roman" w:eastAsia="Times New Roman" w:hAnsi="Times New Roman" w:cs="Times New Roman"/>
+          <w:color w:val="1B1C1D"/>
+          <w:kern w:val="36"/>
+          <w14:ligatures w14:val="none"/>
+        </w:rPr>
+        <w:t xml:space="preserve">' model specifying which transitions between tasks accessing a shared resource pose an information leakage risk. When a task finishes using a resource and another task begins, if a </w:t>
+      </w:r>
+      <w:proofErr w:type="spellStart"/>
+      <w:r>
+        <w:rPr>
+          <w:rFonts w:ascii="Times New Roman" w:eastAsia="Times New Roman" w:hAnsi="Times New Roman" w:cs="Times New Roman"/>
+          <w:color w:val="1B1C1D"/>
+          <w:kern w:val="36"/>
+          <w14:ligatures w14:val="none"/>
+        </w:rPr>
+        <w:t>noleak</w:t>
+      </w:r>
+      <w:proofErr w:type="spellEnd"/>
+      <w:r>
+        <w:rPr>
+          <w:rFonts w:ascii="Times New Roman" w:eastAsia="Times New Roman" w:hAnsi="Times New Roman" w:cs="Times New Roman"/>
+          <w:color w:val="1B1C1D"/>
+          <w:kern w:val="36"/>
+          <w14:ligatures w14:val="none"/>
+        </w:rPr>
+        <w:t xml:space="preserve"> relation exists between them for that resource, </w:t>
+      </w:r>
+      <w:r>
+        <w:rPr>
+          <w:rFonts w:ascii="Times New Roman" w:eastAsia="Times New Roman" w:hAnsi="Times New Roman" w:cs="Times New Roman"/>
+          <w:color w:val="1B1C1D"/>
+          <w:kern w:val="36"/>
+          <w14:ligatures w14:val="none"/>
+        </w:rPr>
+        <w:t>a flush task is executed to sanitize the resource state (e.g., clearing cache entries) preventing data remnants from being exploited in side-channel attacks</w:t>
+      </w:r>
+      <w:r>
+        <w:rPr>
+          <w:rFonts w:ascii="Times New Roman" w:eastAsia="Times New Roman" w:hAnsi="Times New Roman" w:cs="Times New Roman"/>
+          <w:color w:val="1B1C1D"/>
+          <w:kern w:val="36"/>
+          <w14:ligatures w14:val="none"/>
+        </w:rPr>
+        <w:t xml:space="preserve">. </w:t>
+      </w:r>
+      <w:r>
+        <w:rPr>
+          <w:rFonts w:ascii="Times New Roman" w:eastAsia="Times New Roman" w:hAnsi="Times New Roman" w:cs="Times New Roman"/>
+          <w:color w:val="1B1C1D"/>
+          <w:kern w:val="36"/>
+          <w14:ligatures w14:val="none"/>
+        </w:rPr>
+        <w:t>FT-PIP's contribution lies in providing a framework and associated schedulability analysis that guarantees timing constraints while satisfying security requirements for multiple shared resources on multiprocessor platforms, a scenario largely unaddressed by previous methods</w:t>
+      </w:r>
+      <w:r>
+        <w:rPr>
+          <w:rFonts w:ascii="Times New Roman" w:eastAsia="Times New Roman" w:hAnsi="Times New Roman" w:cs="Times New Roman"/>
+          <w:color w:val="1B1C1D"/>
+          <w:kern w:val="36"/>
+          <w14:ligatures w14:val="none"/>
+        </w:rPr>
+        <w:t>.</w:t>
+      </w:r>
+    </w:p>
+    <w:p>
+      <w:pPr>
+        <w:spacing w:after="0" w:line="480" w:lineRule="auto"/>
+        <w:outlineLvl w:val="0"/>
+        <w:rPr>
+          <w:rFonts w:ascii="Times New Roman" w:eastAsia="Times New Roman" w:hAnsi="Times New Roman" w:cs="Times New Roman"/>
+          <w:color w:val="1B1C1D"/>
+          <w:kern w:val="36"/>
+          <w14:ligatures w14:val="none"/>
+        </w:rPr>
+      </w:pPr>
+      <w:r>
+        <w:rPr>
+          <w:rFonts w:ascii="Times New Roman" w:eastAsia="Times New Roman" w:hAnsi="Times New Roman" w:cs="Times New Roman"/>
+          <w:b/>
+          <w:bCs/>
+          <w:color w:val="1B1C1D"/>
+          <w:kern w:val="36"/>
+          <w14:ligatures w14:val="none"/>
+        </w:rPr>
+        <w:lastRenderedPageBreak/>
+        <w:t>Conclusion</w:t>
       </w:r>
     </w:p>
     <w:p>
@@ -1296,94 +1378,114 @@
           <w:kern w:val="36"/>
           <w14:ligatures w14:val="none"/>
         </w:rPr>
-        <w:t>Complementing randomization techniques, protocols addressing information leakage through shared resources are also crucial. The Flush Task Incorporated Priority-Inheritance Protocol (FT-</w:t>
-      </w:r>
-      <w:r>
-        <w:rPr>
-          <w:rFonts w:ascii="Times New Roman" w:eastAsia="Times New Roman" w:hAnsi="Times New Roman" w:cs="Times New Roman"/>
-          <w:color w:val="1B1C1D"/>
-          <w:kern w:val="36"/>
-          <w14:ligatures w14:val="none"/>
-        </w:rPr>
-        <w:lastRenderedPageBreak/>
-        <w:t>PIP) tackles this by integrating resource sanitization with traditional priority inheritance mechanisms in multiprocessor environments. This dual approach manages priority inversion stemming from resource contention while actively preventing data remnants in shared resources, like caches, from being exploited. Together, these distinct approaches</w:t>
-      </w:r>
-      <w:r>
-        <w:rPr>
-          <w:rFonts w:ascii="Times New Roman" w:eastAsia="Times New Roman" w:hAnsi="Times New Roman" w:cs="Times New Roman"/>
-          <w:color w:val="1B1C1D"/>
-          <w:kern w:val="36"/>
-          <w14:ligatures w14:val="none"/>
-        </w:rPr>
-        <w:t xml:space="preserve"> – </w:t>
-      </w:r>
-      <w:r>
-        <w:rPr>
-          <w:rFonts w:ascii="Times New Roman" w:eastAsia="Times New Roman" w:hAnsi="Times New Roman" w:cs="Times New Roman"/>
-          <w:color w:val="1B1C1D"/>
-          <w:kern w:val="36"/>
-          <w14:ligatures w14:val="none"/>
-        </w:rPr>
-        <w:t>randomization</w:t>
-      </w:r>
-      <w:r>
-        <w:rPr>
-          <w:rFonts w:ascii="Times New Roman" w:eastAsia="Times New Roman" w:hAnsi="Times New Roman" w:cs="Times New Roman"/>
-          <w:color w:val="1B1C1D"/>
-          <w:kern w:val="36"/>
-          <w14:ligatures w14:val="none"/>
-        </w:rPr>
-        <w:t xml:space="preserve"> </w:t>
-      </w:r>
-      <w:r>
-        <w:rPr>
-          <w:rFonts w:ascii="Times New Roman" w:eastAsia="Times New Roman" w:hAnsi="Times New Roman" w:cs="Times New Roman"/>
-          <w:color w:val="1B1C1D"/>
-          <w:kern w:val="36"/>
-          <w14:ligatures w14:val="none"/>
-        </w:rPr>
-        <w:t>against timing channels and resource sanitization against leakage</w:t>
-      </w:r>
-      <w:r>
-        <w:rPr>
-          <w:rFonts w:ascii="Times New Roman" w:eastAsia="Times New Roman" w:hAnsi="Times New Roman" w:cs="Times New Roman"/>
-          <w:color w:val="1B1C1D"/>
-          <w:kern w:val="36"/>
-          <w14:ligatures w14:val="none"/>
-        </w:rPr>
-        <w:t xml:space="preserve"> – </w:t>
-      </w:r>
-      <w:r>
-        <w:rPr>
-          <w:rFonts w:ascii="Times New Roman" w:eastAsia="Times New Roman" w:hAnsi="Times New Roman" w:cs="Times New Roman"/>
-          <w:color w:val="1B1C1D"/>
-          <w:kern w:val="36"/>
-          <w14:ligatures w14:val="none"/>
-        </w:rPr>
-        <w:t>illustrate</w:t>
-      </w:r>
-      <w:r>
-        <w:rPr>
-          <w:rFonts w:ascii="Times New Roman" w:eastAsia="Times New Roman" w:hAnsi="Times New Roman" w:cs="Times New Roman"/>
-          <w:color w:val="1B1C1D"/>
-          <w:kern w:val="36"/>
-          <w14:ligatures w14:val="none"/>
-        </w:rPr>
-        <w:t xml:space="preserve"> </w:t>
-      </w:r>
-      <w:r>
-        <w:rPr>
-          <w:rFonts w:ascii="Times New Roman" w:eastAsia="Times New Roman" w:hAnsi="Times New Roman" w:cs="Times New Roman"/>
-          <w:color w:val="1B1C1D"/>
-          <w:kern w:val="36"/>
-          <w14:ligatures w14:val="none"/>
-        </w:rPr>
-        <w:t>the ongoing efforts to develop robust real-time systems that effectively balance stringent timing requirements with the critical need for security against sophisticated, timing-based threats.</w:t>
+        <w:t>E</w:t>
+      </w:r>
+      <w:r>
+        <w:rPr>
+          <w:rFonts w:ascii="Times New Roman" w:eastAsia="Times New Roman" w:hAnsi="Times New Roman" w:cs="Times New Roman"/>
+          <w:color w:val="1B1C1D"/>
+          <w:kern w:val="36"/>
+          <w14:ligatures w14:val="none"/>
+        </w:rPr>
+        <w:t>nhancing the security of real-time systems against timing-based attacks necessitates innovative scheduling strategies. Protocols like TimeDice and REORDER++ leverage controlled randomization to disrupt adversarial exploitation of system predictability. TimeDice introduces schedulability-preserving randomization at the partition level, specifically targeting the mitigation of covert timing channels by adding uncertainty to partition execution sequences. Similarly, REORDER++ employs enhanced online randomization within dynamic-priority systems, dynamically assessing inversion budgets to maximize unpredictability and counter schedule-based side-channel attacks without compromising guaranteed deadlines. Both represent significant advancements in using randomization as a defense mechanism against timing inference.</w:t>
       </w:r>
     </w:p>
     <w:p>
       <w:pPr>
         <w:spacing w:after="0" w:line="480" w:lineRule="auto"/>
+        <w:ind w:firstLine="360"/>
+        <w:outlineLvl w:val="0"/>
+        <w:rPr>
+          <w:rFonts w:ascii="Times New Roman" w:eastAsia="Times New Roman" w:hAnsi="Times New Roman" w:cs="Times New Roman"/>
+          <w:color w:val="1B1C1D"/>
+          <w:kern w:val="36"/>
+          <w14:ligatures w14:val="none"/>
+        </w:rPr>
+      </w:pPr>
+      <w:r>
+        <w:rPr>
+          <w:rFonts w:ascii="Times New Roman" w:eastAsia="Times New Roman" w:hAnsi="Times New Roman" w:cs="Times New Roman"/>
+          <w:color w:val="1B1C1D"/>
+          <w:kern w:val="36"/>
+          <w14:ligatures w14:val="none"/>
+        </w:rPr>
+        <w:t>Complementing randomization techniques, protocols addressing information leakage through shared resources are also crucial. The Flush Task Incorporated Priority-Inheritance Protocol (FT-PIP) tackles this by integrating resource sanitization with traditional priority inheritance mechanisms in multiprocessor environments. This dual approach manages priority inversion stemming from resource contention while actively preventing data remnants in shared resources, like caches, from being exploited. Together, these distinct approaches</w:t>
+      </w:r>
+      <w:r>
+        <w:rPr>
+          <w:rFonts w:ascii="Times New Roman" w:eastAsia="Times New Roman" w:hAnsi="Times New Roman" w:cs="Times New Roman"/>
+          <w:color w:val="1B1C1D"/>
+          <w:kern w:val="36"/>
+          <w14:ligatures w14:val="none"/>
+        </w:rPr>
+        <w:t xml:space="preserve"> – </w:t>
+      </w:r>
+      <w:r>
+        <w:rPr>
+          <w:rFonts w:ascii="Times New Roman" w:eastAsia="Times New Roman" w:hAnsi="Times New Roman" w:cs="Times New Roman"/>
+          <w:color w:val="1B1C1D"/>
+          <w:kern w:val="36"/>
+          <w14:ligatures w14:val="none"/>
+        </w:rPr>
+        <w:t>randomization</w:t>
+      </w:r>
+      <w:r>
+        <w:rPr>
+          <w:rFonts w:ascii="Times New Roman" w:eastAsia="Times New Roman" w:hAnsi="Times New Roman" w:cs="Times New Roman"/>
+          <w:color w:val="1B1C1D"/>
+          <w:kern w:val="36"/>
+          <w14:ligatures w14:val="none"/>
+        </w:rPr>
+        <w:t xml:space="preserve"> </w:t>
+      </w:r>
+      <w:r>
+        <w:rPr>
+          <w:rFonts w:ascii="Times New Roman" w:eastAsia="Times New Roman" w:hAnsi="Times New Roman" w:cs="Times New Roman"/>
+          <w:color w:val="1B1C1D"/>
+          <w:kern w:val="36"/>
+          <w14:ligatures w14:val="none"/>
+        </w:rPr>
+        <w:t>against timing channels and resource sanitization against leakage</w:t>
+      </w:r>
+      <w:r>
+        <w:rPr>
+          <w:rFonts w:ascii="Times New Roman" w:eastAsia="Times New Roman" w:hAnsi="Times New Roman" w:cs="Times New Roman"/>
+          <w:color w:val="1B1C1D"/>
+          <w:kern w:val="36"/>
+          <w14:ligatures w14:val="none"/>
+        </w:rPr>
+        <w:t xml:space="preserve"> – </w:t>
+      </w:r>
+      <w:r>
+        <w:rPr>
+          <w:rFonts w:ascii="Times New Roman" w:eastAsia="Times New Roman" w:hAnsi="Times New Roman" w:cs="Times New Roman"/>
+          <w:color w:val="1B1C1D"/>
+          <w:kern w:val="36"/>
+          <w14:ligatures w14:val="none"/>
+        </w:rPr>
+        <w:t>illustrate</w:t>
+      </w:r>
+      <w:r>
+        <w:rPr>
+          <w:rFonts w:ascii="Times New Roman" w:eastAsia="Times New Roman" w:hAnsi="Times New Roman" w:cs="Times New Roman"/>
+          <w:color w:val="1B1C1D"/>
+          <w:kern w:val="36"/>
+          <w14:ligatures w14:val="none"/>
+        </w:rPr>
+        <w:t xml:space="preserve"> </w:t>
+      </w:r>
+      <w:r>
+        <w:rPr>
+          <w:rFonts w:ascii="Times New Roman" w:eastAsia="Times New Roman" w:hAnsi="Times New Roman" w:cs="Times New Roman"/>
+          <w:color w:val="1B1C1D"/>
+          <w:kern w:val="36"/>
+          <w14:ligatures w14:val="none"/>
+        </w:rPr>
+        <w:t>the ongoing efforts to develop robust real-time systems that effectively balance stringent timing requirements with the critical need for security against sophisticated, timing-based threats.</w:t>
+      </w:r>
+    </w:p>
+    <w:p>
+      <w:pPr>
         <w:rPr>
           <w:rFonts w:ascii="Times New Roman" w:hAnsi="Times New Roman" w:cs="Times New Roman"/>
           <w:b/>
@@ -1396,6 +1498,25 @@
           <w:b/>
           <w:bCs/>
         </w:rPr>
+        <w:br w:type="page"/>
+      </w:r>
+    </w:p>
+    <w:p>
+      <w:pPr>
+        <w:spacing w:after="0" w:line="480" w:lineRule="auto"/>
+        <w:rPr>
+          <w:rFonts w:ascii="Times New Roman" w:hAnsi="Times New Roman" w:cs="Times New Roman"/>
+          <w:b/>
+          <w:bCs/>
+        </w:rPr>
+      </w:pPr>
+      <w:r>
+        <w:rPr>
+          <w:rFonts w:ascii="Times New Roman" w:hAnsi="Times New Roman" w:cs="Times New Roman"/>
+          <w:b/>
+          <w:bCs/>
+        </w:rPr>
+        <w:lastRenderedPageBreak/>
         <w:t>References</w:t>
       </w:r>
     </w:p>
@@ -1631,7 +1752,6 @@
         <w:rPr>
           <w:rFonts w:ascii="Times New Roman" w:hAnsi="Times New Roman" w:cs="Times New Roman"/>
         </w:rPr>
-        <w:lastRenderedPageBreak/>
         <w:t xml:space="preserve">Y. Tang, X. Jiang, N. Guan, S. Liu, X. Luo and W. Yi, "Optimizing End-to-End Latency of Sporadic Cause-Effect Chains Using Priority Inheritance," </w:t>
       </w:r>
       <w:r>
@@ -1729,7 +1849,16 @@
           <w:i/>
           <w:iCs/>
         </w:rPr>
-        <w:t>2021 International Symposium on Secure and Private Execution Environment Design (SEED)</w:t>
+        <w:t xml:space="preserve">2021 International </w:t>
+      </w:r>
+      <w:r>
+        <w:rPr>
+          <w:rFonts w:ascii="Times New Roman" w:hAnsi="Times New Roman" w:cs="Times New Roman"/>
+          <w:i/>
+          <w:iCs/>
+        </w:rPr>
+        <w:lastRenderedPageBreak/>
+        <w:t>Symposium on Secure and Private Execution Environment Design (SEED)</w:t>
       </w:r>
       <w:r>
         <w:rPr>

</xml_diff>